<commit_message>
feat: ambiente de teste
</commit_message>
<xml_diff>
--- a/outputs/2025/05maio/Relatorio_Gerencial_Completo_2025-05.docx
+++ b/outputs/2025/05maio/Relatorio_Gerencial_Completo_2025-05.docx
@@ -11134,7 +11134,7 @@
         <w:rPr>
           <w:b/>
         </w:rPr>
-        <w:t>R$ 5.896,77</w:t>
+        <w:t>R$ 5.643,44</w:t>
       </w:r>
       <w:r>
         <w:t xml:space="preserve">, seguidos pelos Analistas, com </w:t>
@@ -11143,7 +11143,7 @@
         <w:rPr>
           <w:b/>
         </w:rPr>
-        <w:t>R$ 2.456,64.</w:t>
+        <w:t>R$ 2.385,78.</w:t>
       </w:r>
     </w:p>
     <w:p>

</xml_diff>

<commit_message>
fix: bug quebra de linhas e query grafico8
</commit_message>
<xml_diff>
--- a/outputs/2025/05maio/Relatorio_Gerencial_Completo_2025-05.docx
+++ b/outputs/2025/05maio/Relatorio_Gerencial_Completo_2025-05.docx
@@ -305,18 +305,10 @@
       </w:r>
     </w:p>
     <w:p>
-      <w:pPr>
-        <w:jc w:val="center"/>
-      </w:pPr>
-      <w:r>
-        <w:t>Tabela 1. Evolução mensal das adesões</w:t>
-      </w:r>
-    </w:p>
-    <w:p>
       <w:r>
         <w:drawing>
           <wp:inline xmlns:a="http://schemas.openxmlformats.org/drawingml/2006/main" xmlns:pic="http://schemas.openxmlformats.org/drawingml/2006/picture">
-            <wp:extent cx="5669280" cy="3218498"/>
+            <wp:extent cx="5669280" cy="3439954"/>
             <wp:docPr id="9" name="Picture 9"/>
             <wp:cNvGraphicFramePr>
               <a:graphicFrameLocks noChangeAspect="1"/>
@@ -337,7 +329,7 @@
                   <pic:spPr>
                     <a:xfrm>
                       <a:off x="0" y="0"/>
-                      <a:ext cx="5669280" cy="3218498"/>
+                      <a:ext cx="5669280" cy="3439954"/>
                     </a:xfrm>
                     <a:prstGeom prst="rect"/>
                   </pic:spPr>
@@ -419,18 +411,10 @@
       </w:r>
     </w:p>
     <w:p>
-      <w:pPr>
-        <w:jc w:val="center"/>
-      </w:pPr>
-      <w:r>
-        <w:t>Gráfico 1. Distribuição de participantes por sexo e grupo de idade*</w:t>
-      </w:r>
-    </w:p>
-    <w:p>
       <w:r>
         <w:drawing>
           <wp:inline xmlns:a="http://schemas.openxmlformats.org/drawingml/2006/main" xmlns:pic="http://schemas.openxmlformats.org/drawingml/2006/picture">
-            <wp:extent cx="5669280" cy="3891855"/>
+            <wp:extent cx="5669280" cy="4326699"/>
             <wp:docPr id="11" name="Picture 11"/>
             <wp:cNvGraphicFramePr>
               <a:graphicFrameLocks noChangeAspect="1"/>
@@ -451,7 +435,7 @@
                   <pic:spPr>
                     <a:xfrm>
                       <a:off x="0" y="0"/>
-                      <a:ext cx="5669280" cy="3891855"/>
+                      <a:ext cx="5669280" cy="4326699"/>
                     </a:xfrm>
                     <a:prstGeom prst="rect"/>
                   </pic:spPr>
@@ -473,22 +457,13 @@
     </w:p>
     <w:p>
       <w:pPr>
-        <w:spacing w:after="120"/>
-        <w:jc w:val="center"/>
-      </w:pPr>
-      <w:r>
-        <w:t>Tabela 2. Distribuição de participantes por cargo</w:t>
-      </w:r>
-    </w:p>
-    <w:p>
-      <w:pPr>
         <w:spacing w:before="0"/>
         <w:jc w:val="center"/>
       </w:pPr>
       <w:r>
         <w:drawing>
           <wp:inline xmlns:a="http://schemas.openxmlformats.org/drawingml/2006/main" xmlns:pic="http://schemas.openxmlformats.org/drawingml/2006/picture">
-            <wp:extent cx="3657600" cy="2267712"/>
+            <wp:extent cx="3657600" cy="2450592"/>
             <wp:docPr id="12" name="Picture 12"/>
             <wp:cNvGraphicFramePr>
               <a:graphicFrameLocks noChangeAspect="1"/>
@@ -509,7 +484,7 @@
                   <pic:spPr>
                     <a:xfrm>
                       <a:off x="0" y="0"/>
-                      <a:ext cx="3657600" cy="2267712"/>
+                      <a:ext cx="3657600" cy="2450592"/>
                     </a:xfrm>
                     <a:prstGeom prst="rect"/>
                   </pic:spPr>
@@ -535,14 +510,6 @@
       </w:pPr>
       <w:r>
         <w:t>No mês de maio/2025, o (a) STJ obteve o maior número de adesões (58) e, desde o início do funcionamento da Funpresp-Jud, a JUSTIÇA TRABALHISTA permanece com o maior número de participantes (13603).</w:t>
-      </w:r>
-    </w:p>
-    <w:p>
-      <w:pPr>
-        <w:jc w:val="center"/>
-      </w:pPr>
-      <w:r>
-        <w:t>Gráfico 2. Distribuição de participantes por ramo da justiça (maio/2025)</w:t>
       </w:r>
     </w:p>
     <w:p>
@@ -579,14 +546,6 @@
             </a:graphic>
           </wp:inline>
         </w:drawing>
-      </w:r>
-    </w:p>
-    <w:p>
-      <w:pPr>
-        <w:jc w:val="center"/>
-      </w:pPr>
-      <w:r>
-        <w:t>Gráfico 3. Distribuição de participantes por ramo da justiça (acumulado)</w:t>
       </w:r>
     </w:p>
     <w:p>
@@ -10645,17 +10604,9 @@
         <w:jc w:val="center"/>
       </w:pPr>
       <w:r>
-        <w:t>Gráfico 4. Distribuição regime de tributação (maio/2025)</w:t>
-      </w:r>
-    </w:p>
-    <w:p>
-      <w:pPr>
-        <w:jc w:val="center"/>
-      </w:pPr>
-      <w:r>
         <w:drawing>
           <wp:inline xmlns:a="http://schemas.openxmlformats.org/drawingml/2006/main" xmlns:pic="http://schemas.openxmlformats.org/drawingml/2006/picture">
-            <wp:extent cx="4572000" cy="2955769"/>
+            <wp:extent cx="4572000" cy="2957233"/>
             <wp:docPr id="15" name="Picture 15"/>
             <wp:cNvGraphicFramePr>
               <a:graphicFrameLocks noChangeAspect="1"/>
@@ -10676,7 +10627,7 @@
                   <pic:spPr>
                     <a:xfrm>
                       <a:off x="0" y="0"/>
-                      <a:ext cx="4572000" cy="2955769"/>
+                      <a:ext cx="4572000" cy="2957233"/>
                     </a:xfrm>
                     <a:prstGeom prst="rect"/>
                   </pic:spPr>
@@ -10692,17 +10643,9 @@
         <w:jc w:val="center"/>
       </w:pPr>
       <w:r>
-        <w:t>Gráfico 5. Distribuição regime de tributação (acumulado)</w:t>
-      </w:r>
-    </w:p>
-    <w:p>
-      <w:pPr>
-        <w:jc w:val="center"/>
-      </w:pPr>
-      <w:r>
         <w:drawing>
           <wp:inline xmlns:a="http://schemas.openxmlformats.org/drawingml/2006/main" xmlns:pic="http://schemas.openxmlformats.org/drawingml/2006/picture">
-            <wp:extent cx="4572000" cy="2955769"/>
+            <wp:extent cx="4572000" cy="2957233"/>
             <wp:docPr id="16" name="Picture 16"/>
             <wp:cNvGraphicFramePr>
               <a:graphicFrameLocks noChangeAspect="1"/>
@@ -10723,7 +10666,7 @@
                   <pic:spPr>
                     <a:xfrm>
                       <a:off x="0" y="0"/>
-                      <a:ext cx="4572000" cy="2955769"/>
+                      <a:ext cx="4572000" cy="2957233"/>
                     </a:xfrm>
                     <a:prstGeom prst="rect"/>
                   </pic:spPr>
@@ -10768,14 +10711,6 @@
       </w:r>
     </w:p>
     <w:p>
-      <w:pPr>
-        <w:jc w:val="center"/>
-      </w:pPr>
-      <w:r>
-        <w:t>Gráfico 6. Distribuição do percentual de contribuição (maio/2025)</w:t>
-      </w:r>
-    </w:p>
-    <w:p>
       <w:r>
         <w:drawing>
           <wp:inline xmlns:a="http://schemas.openxmlformats.org/drawingml/2006/main" xmlns:pic="http://schemas.openxmlformats.org/drawingml/2006/picture">
@@ -10809,14 +10744,6 @@
             </a:graphic>
           </wp:inline>
         </w:drawing>
-      </w:r>
-    </w:p>
-    <w:p>
-      <w:pPr>
-        <w:jc w:val="center"/>
-      </w:pPr>
-      <w:r>
-        <w:t>Gráfico 7. Distribuição do percentual de contribuição (acumulado)</w:t>
       </w:r>
     </w:p>
     <w:p>
@@ -10877,17 +10804,9 @@
         <w:jc w:val="center"/>
       </w:pPr>
       <w:r>
-        <w:t>Tabela 4. Arrecadação de contribuições por mês competência</w:t>
-      </w:r>
-    </w:p>
-    <w:p>
-      <w:pPr>
-        <w:jc w:val="center"/>
-      </w:pPr>
-      <w:r>
         <w:drawing>
           <wp:inline xmlns:a="http://schemas.openxmlformats.org/drawingml/2006/main" xmlns:pic="http://schemas.openxmlformats.org/drawingml/2006/picture">
-            <wp:extent cx="3657600" cy="1139952"/>
+            <wp:extent cx="3657600" cy="1322831"/>
             <wp:docPr id="19" name="Picture 19"/>
             <wp:cNvGraphicFramePr>
               <a:graphicFrameLocks noChangeAspect="1"/>
@@ -10908,7 +10827,7 @@
                   <pic:spPr>
                     <a:xfrm>
                       <a:off x="0" y="0"/>
-                      <a:ext cx="3657600" cy="1139952"/>
+                      <a:ext cx="3657600" cy="1322831"/>
                     </a:xfrm>
                     <a:prstGeom prst="rect"/>
                   </pic:spPr>
@@ -10930,20 +10849,10 @@
         <w:rPr>
           <w:b/>
         </w:rPr>
-        <w:t>R$ 2.836.874,54</w:t>
+        <w:t>R$ 110.343,25</w:t>
       </w:r>
       <w:r>
         <w:t>. Grande parte desse valor se deve ao repasse realizado por um dos órgãos apenas da contribuição dos participantes, sem o correspondente aporte do patrocinador.</w:t>
-      </w:r>
-    </w:p>
-    <w:p>
-      <w:pPr>
-        <w:spacing w:after="120"/>
-        <w:jc w:val="center"/>
-      </w:pPr>
-      <w:r>
-        <w:br/>
-        <w:t>Gráfico 8. Contribuição normal (participante e patrocinador)</w:t>
       </w:r>
     </w:p>
     <w:p>
@@ -10954,7 +10863,7 @@
       <w:r>
         <w:drawing>
           <wp:inline xmlns:a="http://schemas.openxmlformats.org/drawingml/2006/main" xmlns:pic="http://schemas.openxmlformats.org/drawingml/2006/picture">
-            <wp:extent cx="4572000" cy="3890608"/>
+            <wp:extent cx="4572000" cy="4207479"/>
             <wp:docPr id="20" name="Picture 20"/>
             <wp:cNvGraphicFramePr>
               <a:graphicFrameLocks noChangeAspect="1"/>
@@ -10975,7 +10884,7 @@
                   <pic:spPr>
                     <a:xfrm>
                       <a:off x="0" y="0"/>
-                      <a:ext cx="4572000" cy="3890608"/>
+                      <a:ext cx="4572000" cy="4207479"/>
                     </a:xfrm>
                     <a:prstGeom prst="rect"/>
                   </pic:spPr>
@@ -11004,18 +10913,10 @@
       </w:r>
     </w:p>
     <w:p>
-      <w:pPr>
-        <w:jc w:val="center"/>
-      </w:pPr>
-      <w:r>
-        <w:t>Tabela 5. Arrecadação por tipo de contribuição</w:t>
-      </w:r>
-    </w:p>
-    <w:p>
       <w:r>
         <w:drawing>
           <wp:inline xmlns:a="http://schemas.openxmlformats.org/drawingml/2006/main" xmlns:pic="http://schemas.openxmlformats.org/drawingml/2006/picture">
-            <wp:extent cx="5669280" cy="3514954"/>
+            <wp:extent cx="5669280" cy="3798418"/>
             <wp:docPr id="21" name="Picture 21"/>
             <wp:cNvGraphicFramePr>
               <a:graphicFrameLocks noChangeAspect="1"/>
@@ -11036,7 +10937,7 @@
                   <pic:spPr>
                     <a:xfrm>
                       <a:off x="0" y="0"/>
-                      <a:ext cx="5669280" cy="3514954"/>
+                      <a:ext cx="5669280" cy="3798418"/>
                     </a:xfrm>
                     <a:prstGeom prst="rect"/>
                   </pic:spPr>
@@ -11084,7 +10985,7 @@
         <w:rPr>
           <w:b/>
         </w:rPr>
-        <w:t>R$ 357,27.</w:t>
+        <w:t>R$ 357,25.</w:t>
       </w:r>
     </w:p>
     <w:p>
@@ -11108,17 +11009,9 @@
         <w:jc w:val="center"/>
       </w:pPr>
       <w:r>
-        <w:t>Tabela 6. Arrecadação por cargo/representatividade (participantes patrocinados)</w:t>
-      </w:r>
-    </w:p>
-    <w:p>
-      <w:pPr>
-        <w:jc w:val="center"/>
-      </w:pPr>
-      <w:r>
         <w:drawing>
           <wp:inline xmlns:a="http://schemas.openxmlformats.org/drawingml/2006/main" xmlns:pic="http://schemas.openxmlformats.org/drawingml/2006/picture">
-            <wp:extent cx="5669280" cy="2137490"/>
+            <wp:extent cx="5669280" cy="2334797"/>
             <wp:docPr id="22" name="Picture 22"/>
             <wp:cNvGraphicFramePr>
               <a:graphicFrameLocks noChangeAspect="1"/>
@@ -11139,7 +11032,7 @@
                   <pic:spPr>
                     <a:xfrm>
                       <a:off x="0" y="0"/>
-                      <a:ext cx="5669280" cy="2137490"/>
+                      <a:ext cx="5669280" cy="2334797"/>
                     </a:xfrm>
                     <a:prstGeom prst="rect"/>
                   </pic:spPr>
@@ -11165,14 +11058,6 @@
       </w:pPr>
       <w:r>
         <w:t>Em maio/2025 a JUSTIÇA TRABALHISTA teve o maior volume de contribuições. Desde o início do plano, temos a Justiça Trabalhista com maior patrimônio acumulado.</w:t>
-      </w:r>
-    </w:p>
-    <w:p>
-      <w:pPr>
-        <w:jc w:val="center"/>
-      </w:pPr>
-      <w:r>
-        <w:t>Gráfico 9. Distribuição de contribuições por ramo do patrocinador (maio/2025)</w:t>
       </w:r>
     </w:p>
     <w:p>
@@ -11212,15 +11097,6 @@
             </a:graphic>
           </wp:inline>
         </w:drawing>
-      </w:r>
-    </w:p>
-    <w:p>
-      <w:pPr>
-        <w:jc w:val="center"/>
-      </w:pPr>
-      <w:r>
-        <w:br/>
-        <w:t>Gráfico 10. Distribuição do patrimônio por ramo da justiça (acumulado)</w:t>
       </w:r>
     </w:p>
     <w:p>
@@ -11273,19 +11149,20 @@
     </w:p>
     <w:p>
       <w:pPr>
+        <w:keepNext/>
+        <w:spacing w:before="240" w:after="120"/>
+        <w:jc w:val="center"/>
+      </w:pPr>
+      <w:r>
+        <w:t>Tabela 7. Arrecadação e Patrimônio por patrocinador</w:t>
+      </w:r>
+    </w:p>
+    <w:p>
+      <w:pPr>
         <w:pStyle w:val="CorpoComRecuo"/>
       </w:pPr>
       <w:r>
         <w:t>Em maio/2025, o MPF ficou no topo do ranking na contribuição mensal e o MPF continua com o maior patrimônio por patrocinador.</w:t>
-      </w:r>
-    </w:p>
-    <w:p>
-      <w:pPr>
-        <w:keepNext/>
-        <w:jc w:val="center"/>
-      </w:pPr>
-      <w:r>
-        <w:t>Tabela 7. Arrecadação e Patrimônio por patrocinador</w:t>
       </w:r>
     </w:p>
     <w:tbl>

</xml_diff>

<commit_message>
feat: nova lógica para a tabela 1
</commit_message>
<xml_diff>
--- a/outputs/2025/05maio/Relatorio_Gerencial_Completo_2025-05.docx
+++ b/outputs/2025/05maio/Relatorio_Gerencial_Completo_2025-05.docx
@@ -301,14 +301,14 @@
         <w:pStyle w:val="CorpoComRecuo"/>
       </w:pPr>
       <w:r>
-        <w:t>Com as movimentações ocorridas no mês de maio de 2025, houve a entrada de 81 participantes na base. As ocorrências estão assim distribuídas:</w:t>
+        <w:t>As ocorrências e movimentações do mês de maio de 2025 estão assim distribuídas:</w:t>
       </w:r>
     </w:p>
     <w:p>
       <w:r>
         <w:drawing>
           <wp:inline xmlns:a="http://schemas.openxmlformats.org/drawingml/2006/main" xmlns:pic="http://schemas.openxmlformats.org/drawingml/2006/picture">
-            <wp:extent cx="5669280" cy="3439954"/>
+            <wp:extent cx="5669280" cy="2311360"/>
             <wp:docPr id="9" name="Picture 9"/>
             <wp:cNvGraphicFramePr>
               <a:graphicFrameLocks noChangeAspect="1"/>
@@ -329,7 +329,7 @@
                   <pic:spPr>
                     <a:xfrm>
                       <a:off x="0" y="0"/>
-                      <a:ext cx="5669280" cy="3439954"/>
+                      <a:ext cx="5669280" cy="2311360"/>
                     </a:xfrm>
                     <a:prstGeom prst="rect"/>
                   </pic:spPr>
@@ -414,7 +414,7 @@
       <w:r>
         <w:drawing>
           <wp:inline xmlns:a="http://schemas.openxmlformats.org/drawingml/2006/main" xmlns:pic="http://schemas.openxmlformats.org/drawingml/2006/picture">
-            <wp:extent cx="5669280" cy="4326699"/>
+            <wp:extent cx="5669280" cy="4322554"/>
             <wp:docPr id="11" name="Picture 11"/>
             <wp:cNvGraphicFramePr>
               <a:graphicFrameLocks noChangeAspect="1"/>
@@ -435,7 +435,7 @@
                   <pic:spPr>
                     <a:xfrm>
                       <a:off x="0" y="0"/>
-                      <a:ext cx="5669280" cy="4326699"/>
+                      <a:ext cx="5669280" cy="4322554"/>
                     </a:xfrm>
                     <a:prstGeom prst="rect"/>
                   </pic:spPr>
@@ -2784,7 +2784,7 @@
               <w:rPr>
                 <w:sz w:val="16"/>
               </w:rPr>
-              <w:t>SJTO</w:t>
+              <w:t>SJRS</w:t>
             </w:r>
           </w:p>
         </w:tc>
@@ -2841,26 +2841,26 @@
               <w:rPr>
                 <w:sz w:val="16"/>
               </w:rPr>
-              <w:t>61</w:t>
-            </w:r>
-          </w:p>
-        </w:tc>
-        <w:tc>
-          <w:tcPr>
-            <w:tcW w:type="dxa" w:w="1813"/>
-            <w:vAlign w:val="center"/>
-            <w:noWrap/>
-          </w:tcPr>
-          <w:p>
-            <w:pPr>
-              <w:spacing w:before="60" w:after="60"/>
-              <w:jc w:val="center"/>
-            </w:pPr>
-            <w:r>
-              <w:rPr>
-                <w:sz w:val="16"/>
-              </w:rPr>
-              <w:t>0,17%</w:t>
+              <w:t>560</w:t>
+            </w:r>
+          </w:p>
+        </w:tc>
+        <w:tc>
+          <w:tcPr>
+            <w:tcW w:type="dxa" w:w="1813"/>
+            <w:vAlign w:val="center"/>
+            <w:noWrap/>
+          </w:tcPr>
+          <w:p>
+            <w:pPr>
+              <w:spacing w:before="60" w:after="60"/>
+              <w:jc w:val="center"/>
+            </w:pPr>
+            <w:r>
+              <w:rPr>
+                <w:sz w:val="16"/>
+              </w:rPr>
+              <w:t>1,55%</w:t>
             </w:r>
           </w:p>
         </w:tc>
@@ -2881,7 +2881,7 @@
               <w:rPr>
                 <w:sz w:val="16"/>
               </w:rPr>
-              <w:t>TRT12</w:t>
+              <w:t>SJMT</w:t>
             </w:r>
           </w:p>
         </w:tc>
@@ -2938,26 +2938,26 @@
               <w:rPr>
                 <w:sz w:val="16"/>
               </w:rPr>
-              <w:t>546</w:t>
-            </w:r>
-          </w:p>
-        </w:tc>
-        <w:tc>
-          <w:tcPr>
-            <w:tcW w:type="dxa" w:w="1813"/>
-            <w:vAlign w:val="center"/>
-            <w:noWrap/>
-          </w:tcPr>
-          <w:p>
-            <w:pPr>
-              <w:spacing w:before="60" w:after="60"/>
-              <w:jc w:val="center"/>
-            </w:pPr>
-            <w:r>
-              <w:rPr>
-                <w:sz w:val="16"/>
-              </w:rPr>
-              <w:t>1,52%</w:t>
+              <w:t>118</w:t>
+            </w:r>
+          </w:p>
+        </w:tc>
+        <w:tc>
+          <w:tcPr>
+            <w:tcW w:type="dxa" w:w="1813"/>
+            <w:vAlign w:val="center"/>
+            <w:noWrap/>
+          </w:tcPr>
+          <w:p>
+            <w:pPr>
+              <w:spacing w:before="60" w:after="60"/>
+              <w:jc w:val="center"/>
+            </w:pPr>
+            <w:r>
+              <w:rPr>
+                <w:sz w:val="16"/>
+              </w:rPr>
+              <w:t>0,33%</w:t>
             </w:r>
           </w:p>
         </w:tc>
@@ -2978,7 +2978,7 @@
               <w:rPr>
                 <w:sz w:val="16"/>
               </w:rPr>
-              <w:t>SJMT</w:t>
+              <w:t>TREPE</w:t>
             </w:r>
           </w:p>
         </w:tc>
@@ -3035,26 +3035,26 @@
               <w:rPr>
                 <w:sz w:val="16"/>
               </w:rPr>
-              <w:t>118</w:t>
-            </w:r>
-          </w:p>
-        </w:tc>
-        <w:tc>
-          <w:tcPr>
-            <w:tcW w:type="dxa" w:w="1813"/>
-            <w:vAlign w:val="center"/>
-            <w:noWrap/>
-          </w:tcPr>
-          <w:p>
-            <w:pPr>
-              <w:spacing w:before="60" w:after="60"/>
-              <w:jc w:val="center"/>
-            </w:pPr>
-            <w:r>
-              <w:rPr>
-                <w:sz w:val="16"/>
-              </w:rPr>
-              <w:t>0,33%</w:t>
+              <w:t>231</w:t>
+            </w:r>
+          </w:p>
+        </w:tc>
+        <w:tc>
+          <w:tcPr>
+            <w:tcW w:type="dxa" w:w="1813"/>
+            <w:vAlign w:val="center"/>
+            <w:noWrap/>
+          </w:tcPr>
+          <w:p>
+            <w:pPr>
+              <w:spacing w:before="60" w:after="60"/>
+              <w:jc w:val="center"/>
+            </w:pPr>
+            <w:r>
+              <w:rPr>
+                <w:sz w:val="16"/>
+              </w:rPr>
+              <w:t>0,64%</w:t>
             </w:r>
           </w:p>
         </w:tc>
@@ -3075,7 +3075,7 @@
               <w:rPr>
                 <w:sz w:val="16"/>
               </w:rPr>
-              <w:t>TREPE</w:t>
+              <w:t>SJTO</w:t>
             </w:r>
           </w:p>
         </w:tc>
@@ -3132,26 +3132,26 @@
               <w:rPr>
                 <w:sz w:val="16"/>
               </w:rPr>
-              <w:t>231</w:t>
-            </w:r>
-          </w:p>
-        </w:tc>
-        <w:tc>
-          <w:tcPr>
-            <w:tcW w:type="dxa" w:w="1813"/>
-            <w:vAlign w:val="center"/>
-            <w:noWrap/>
-          </w:tcPr>
-          <w:p>
-            <w:pPr>
-              <w:spacing w:before="60" w:after="60"/>
-              <w:jc w:val="center"/>
-            </w:pPr>
-            <w:r>
-              <w:rPr>
-                <w:sz w:val="16"/>
-              </w:rPr>
-              <w:t>0,64%</w:t>
+              <w:t>61</w:t>
+            </w:r>
+          </w:p>
+        </w:tc>
+        <w:tc>
+          <w:tcPr>
+            <w:tcW w:type="dxa" w:w="1813"/>
+            <w:vAlign w:val="center"/>
+            <w:noWrap/>
+          </w:tcPr>
+          <w:p>
+            <w:pPr>
+              <w:spacing w:before="60" w:after="60"/>
+              <w:jc w:val="center"/>
+            </w:pPr>
+            <w:r>
+              <w:rPr>
+                <w:sz w:val="16"/>
+              </w:rPr>
+              <w:t>0,17%</w:t>
             </w:r>
           </w:p>
         </w:tc>
@@ -3172,7 +3172,7 @@
               <w:rPr>
                 <w:sz w:val="16"/>
               </w:rPr>
-              <w:t>SJRS</w:t>
+              <w:t>TRT12</w:t>
             </w:r>
           </w:p>
         </w:tc>
@@ -3229,26 +3229,26 @@
               <w:rPr>
                 <w:sz w:val="16"/>
               </w:rPr>
-              <w:t>560</w:t>
-            </w:r>
-          </w:p>
-        </w:tc>
-        <w:tc>
-          <w:tcPr>
-            <w:tcW w:type="dxa" w:w="1813"/>
-            <w:vAlign w:val="center"/>
-            <w:noWrap/>
-          </w:tcPr>
-          <w:p>
-            <w:pPr>
-              <w:spacing w:before="60" w:after="60"/>
-              <w:jc w:val="center"/>
-            </w:pPr>
-            <w:r>
-              <w:rPr>
-                <w:sz w:val="16"/>
-              </w:rPr>
-              <w:t>1,55%</w:t>
+              <w:t>546</w:t>
+            </w:r>
+          </w:p>
+        </w:tc>
+        <w:tc>
+          <w:tcPr>
+            <w:tcW w:type="dxa" w:w="1813"/>
+            <w:vAlign w:val="center"/>
+            <w:noWrap/>
+          </w:tcPr>
+          <w:p>
+            <w:pPr>
+              <w:spacing w:before="60" w:after="60"/>
+              <w:jc w:val="center"/>
+            </w:pPr>
+            <w:r>
+              <w:rPr>
+                <w:sz w:val="16"/>
+              </w:rPr>
+              <w:t>1,52%</w:t>
             </w:r>
           </w:p>
         </w:tc>
@@ -3269,7 +3269,7 @@
               <w:rPr>
                 <w:sz w:val="16"/>
               </w:rPr>
-              <w:t>CNJ</w:t>
+              <w:t>TRT23</w:t>
             </w:r>
           </w:p>
         </w:tc>
@@ -3326,26 +3326,26 @@
               <w:rPr>
                 <w:sz w:val="16"/>
               </w:rPr>
-              <w:t>192</w:t>
-            </w:r>
-          </w:p>
-        </w:tc>
-        <w:tc>
-          <w:tcPr>
-            <w:tcW w:type="dxa" w:w="1813"/>
-            <w:vAlign w:val="center"/>
-            <w:noWrap/>
-          </w:tcPr>
-          <w:p>
-            <w:pPr>
-              <w:spacing w:before="60" w:after="60"/>
-              <w:jc w:val="center"/>
-            </w:pPr>
-            <w:r>
-              <w:rPr>
-                <w:sz w:val="16"/>
-              </w:rPr>
-              <w:t>0,53%</w:t>
+              <w:t>306</w:t>
+            </w:r>
+          </w:p>
+        </w:tc>
+        <w:tc>
+          <w:tcPr>
+            <w:tcW w:type="dxa" w:w="1813"/>
+            <w:vAlign w:val="center"/>
+            <w:noWrap/>
+          </w:tcPr>
+          <w:p>
+            <w:pPr>
+              <w:spacing w:before="60" w:after="60"/>
+              <w:jc w:val="center"/>
+            </w:pPr>
+            <w:r>
+              <w:rPr>
+                <w:sz w:val="16"/>
+              </w:rPr>
+              <w:t>0,85%</w:t>
             </w:r>
           </w:p>
         </w:tc>
@@ -3366,7 +3366,7 @@
               <w:rPr>
                 <w:sz w:val="16"/>
               </w:rPr>
-              <w:t>TRT23</w:t>
+              <w:t>SJPB</w:t>
             </w:r>
           </w:p>
         </w:tc>
@@ -3423,26 +3423,26 @@
               <w:rPr>
                 <w:sz w:val="16"/>
               </w:rPr>
-              <w:t>306</w:t>
-            </w:r>
-          </w:p>
-        </w:tc>
-        <w:tc>
-          <w:tcPr>
-            <w:tcW w:type="dxa" w:w="1813"/>
-            <w:vAlign w:val="center"/>
-            <w:noWrap/>
-          </w:tcPr>
-          <w:p>
-            <w:pPr>
-              <w:spacing w:before="60" w:after="60"/>
-              <w:jc w:val="center"/>
-            </w:pPr>
-            <w:r>
-              <w:rPr>
-                <w:sz w:val="16"/>
-              </w:rPr>
-              <w:t>0,85%</w:t>
+              <w:t>107</w:t>
+            </w:r>
+          </w:p>
+        </w:tc>
+        <w:tc>
+          <w:tcPr>
+            <w:tcW w:type="dxa" w:w="1813"/>
+            <w:vAlign w:val="center"/>
+            <w:noWrap/>
+          </w:tcPr>
+          <w:p>
+            <w:pPr>
+              <w:spacing w:before="60" w:after="60"/>
+              <w:jc w:val="center"/>
+            </w:pPr>
+            <w:r>
+              <w:rPr>
+                <w:sz w:val="16"/>
+              </w:rPr>
+              <w:t>0,30%</w:t>
             </w:r>
           </w:p>
         </w:tc>
@@ -3463,7 +3463,7 @@
               <w:rPr>
                 <w:sz w:val="16"/>
               </w:rPr>
-              <w:t>SJPB</w:t>
+              <w:t>CNJ</w:t>
             </w:r>
           </w:p>
         </w:tc>
@@ -3520,26 +3520,26 @@
               <w:rPr>
                 <w:sz w:val="16"/>
               </w:rPr>
-              <w:t>107</w:t>
-            </w:r>
-          </w:p>
-        </w:tc>
-        <w:tc>
-          <w:tcPr>
-            <w:tcW w:type="dxa" w:w="1813"/>
-            <w:vAlign w:val="center"/>
-            <w:noWrap/>
-          </w:tcPr>
-          <w:p>
-            <w:pPr>
-              <w:spacing w:before="60" w:after="60"/>
-              <w:jc w:val="center"/>
-            </w:pPr>
-            <w:r>
-              <w:rPr>
-                <w:sz w:val="16"/>
-              </w:rPr>
-              <w:t>0,30%</w:t>
+              <w:t>192</w:t>
+            </w:r>
+          </w:p>
+        </w:tc>
+        <w:tc>
+          <w:tcPr>
+            <w:tcW w:type="dxa" w:w="1813"/>
+            <w:vAlign w:val="center"/>
+            <w:noWrap/>
+          </w:tcPr>
+          <w:p>
+            <w:pPr>
+              <w:spacing w:before="60" w:after="60"/>
+              <w:jc w:val="center"/>
+            </w:pPr>
+            <w:r>
+              <w:rPr>
+                <w:sz w:val="16"/>
+              </w:rPr>
+              <w:t>0,53%</w:t>
             </w:r>
           </w:p>
         </w:tc>
@@ -4045,7 +4045,7 @@
               <w:rPr>
                 <w:sz w:val="16"/>
               </w:rPr>
-              <w:t>TRF3</w:t>
+              <w:t>TRT9</w:t>
             </w:r>
           </w:p>
         </w:tc>
@@ -4102,26 +4102,26 @@
               <w:rPr>
                 <w:sz w:val="16"/>
               </w:rPr>
-              <w:t>500</w:t>
-            </w:r>
-          </w:p>
-        </w:tc>
-        <w:tc>
-          <w:tcPr>
-            <w:tcW w:type="dxa" w:w="1813"/>
-            <w:vAlign w:val="center"/>
-            <w:noWrap/>
-          </w:tcPr>
-          <w:p>
-            <w:pPr>
-              <w:spacing w:before="60" w:after="60"/>
-              <w:jc w:val="center"/>
-            </w:pPr>
-            <w:r>
-              <w:rPr>
-                <w:sz w:val="16"/>
-              </w:rPr>
-              <w:t>1,39%</w:t>
+              <w:t>874</w:t>
+            </w:r>
+          </w:p>
+        </w:tc>
+        <w:tc>
+          <w:tcPr>
+            <w:tcW w:type="dxa" w:w="1813"/>
+            <w:vAlign w:val="center"/>
+            <w:noWrap/>
+          </w:tcPr>
+          <w:p>
+            <w:pPr>
+              <w:spacing w:before="60" w:after="60"/>
+              <w:jc w:val="center"/>
+            </w:pPr>
+            <w:r>
+              <w:rPr>
+                <w:sz w:val="16"/>
+              </w:rPr>
+              <w:t>2,43%</w:t>
             </w:r>
           </w:p>
         </w:tc>
@@ -4142,7 +4142,7 @@
               <w:rPr>
                 <w:sz w:val="16"/>
               </w:rPr>
-              <w:t>TRT9</w:t>
+              <w:t>TRF3</w:t>
             </w:r>
           </w:p>
         </w:tc>
@@ -4199,26 +4199,26 @@
               <w:rPr>
                 <w:sz w:val="16"/>
               </w:rPr>
-              <w:t>874</w:t>
-            </w:r>
-          </w:p>
-        </w:tc>
-        <w:tc>
-          <w:tcPr>
-            <w:tcW w:type="dxa" w:w="1813"/>
-            <w:vAlign w:val="center"/>
-            <w:noWrap/>
-          </w:tcPr>
-          <w:p>
-            <w:pPr>
-              <w:spacing w:before="60" w:after="60"/>
-              <w:jc w:val="center"/>
-            </w:pPr>
-            <w:r>
-              <w:rPr>
-                <w:sz w:val="16"/>
-              </w:rPr>
-              <w:t>2,43%</w:t>
+              <w:t>500</w:t>
+            </w:r>
+          </w:p>
+        </w:tc>
+        <w:tc>
+          <w:tcPr>
+            <w:tcW w:type="dxa" w:w="1813"/>
+            <w:vAlign w:val="center"/>
+            <w:noWrap/>
+          </w:tcPr>
+          <w:p>
+            <w:pPr>
+              <w:spacing w:before="60" w:after="60"/>
+              <w:jc w:val="center"/>
+            </w:pPr>
+            <w:r>
+              <w:rPr>
+                <w:sz w:val="16"/>
+              </w:rPr>
+              <w:t>1,39%</w:t>
             </w:r>
           </w:p>
         </w:tc>
@@ -9380,7 +9380,7 @@
               <w:rPr>
                 <w:sz w:val="16"/>
               </w:rPr>
-              <w:t>TRT8</w:t>
+              <w:t>TJETO</w:t>
             </w:r>
           </w:p>
         </w:tc>
@@ -9437,26 +9437,26 @@
               <w:rPr>
                 <w:sz w:val="16"/>
               </w:rPr>
-              <w:t>554</w:t>
-            </w:r>
-          </w:p>
-        </w:tc>
-        <w:tc>
-          <w:tcPr>
-            <w:tcW w:type="dxa" w:w="1813"/>
-            <w:vAlign w:val="center"/>
-            <w:noWrap/>
-          </w:tcPr>
-          <w:p>
-            <w:pPr>
-              <w:spacing w:before="60" w:after="60"/>
-              <w:jc w:val="center"/>
-            </w:pPr>
-            <w:r>
-              <w:rPr>
-                <w:sz w:val="16"/>
-              </w:rPr>
-              <w:t>1,54%</w:t>
+              <w:t>1</w:t>
+            </w:r>
+          </w:p>
+        </w:tc>
+        <w:tc>
+          <w:tcPr>
+            <w:tcW w:type="dxa" w:w="1813"/>
+            <w:vAlign w:val="center"/>
+            <w:noWrap/>
+          </w:tcPr>
+          <w:p>
+            <w:pPr>
+              <w:spacing w:before="60" w:after="60"/>
+              <w:jc w:val="center"/>
+            </w:pPr>
+            <w:r>
+              <w:rPr>
+                <w:sz w:val="16"/>
+              </w:rPr>
+              <w:t>0,00%</w:t>
             </w:r>
           </w:p>
         </w:tc>
@@ -9477,7 +9477,7 @@
               <w:rPr>
                 <w:sz w:val="16"/>
               </w:rPr>
-              <w:t>TJDFT</w:t>
+              <w:t>TRT8</w:t>
             </w:r>
           </w:p>
         </w:tc>
@@ -9534,26 +9534,26 @@
               <w:rPr>
                 <w:sz w:val="16"/>
               </w:rPr>
-              <w:t>3010</w:t>
-            </w:r>
-          </w:p>
-        </w:tc>
-        <w:tc>
-          <w:tcPr>
-            <w:tcW w:type="dxa" w:w="1813"/>
-            <w:vAlign w:val="center"/>
-            <w:noWrap/>
-          </w:tcPr>
-          <w:p>
-            <w:pPr>
-              <w:spacing w:before="60" w:after="60"/>
-              <w:jc w:val="center"/>
-            </w:pPr>
-            <w:r>
-              <w:rPr>
-                <w:sz w:val="16"/>
-              </w:rPr>
-              <w:t>8,36%</w:t>
+              <w:t>554</w:t>
+            </w:r>
+          </w:p>
+        </w:tc>
+        <w:tc>
+          <w:tcPr>
+            <w:tcW w:type="dxa" w:w="1813"/>
+            <w:vAlign w:val="center"/>
+            <w:noWrap/>
+          </w:tcPr>
+          <w:p>
+            <w:pPr>
+              <w:spacing w:before="60" w:after="60"/>
+              <w:jc w:val="center"/>
+            </w:pPr>
+            <w:r>
+              <w:rPr>
+                <w:sz w:val="16"/>
+              </w:rPr>
+              <w:t>1,54%</w:t>
             </w:r>
           </w:p>
         </w:tc>
@@ -9574,7 +9574,7 @@
               <w:rPr>
                 <w:sz w:val="16"/>
               </w:rPr>
-              <w:t>TRT2</w:t>
+              <w:t>TJDFT</w:t>
             </w:r>
           </w:p>
         </w:tc>
@@ -9631,26 +9631,26 @@
               <w:rPr>
                 <w:sz w:val="16"/>
               </w:rPr>
-              <w:t>1724</w:t>
-            </w:r>
-          </w:p>
-        </w:tc>
-        <w:tc>
-          <w:tcPr>
-            <w:tcW w:type="dxa" w:w="1813"/>
-            <w:vAlign w:val="center"/>
-            <w:noWrap/>
-          </w:tcPr>
-          <w:p>
-            <w:pPr>
-              <w:spacing w:before="60" w:after="60"/>
-              <w:jc w:val="center"/>
-            </w:pPr>
-            <w:r>
-              <w:rPr>
-                <w:sz w:val="16"/>
-              </w:rPr>
-              <w:t>4,79%</w:t>
+              <w:t>3010</w:t>
+            </w:r>
+          </w:p>
+        </w:tc>
+        <w:tc>
+          <w:tcPr>
+            <w:tcW w:type="dxa" w:w="1813"/>
+            <w:vAlign w:val="center"/>
+            <w:noWrap/>
+          </w:tcPr>
+          <w:p>
+            <w:pPr>
+              <w:spacing w:before="60" w:after="60"/>
+              <w:jc w:val="center"/>
+            </w:pPr>
+            <w:r>
+              <w:rPr>
+                <w:sz w:val="16"/>
+              </w:rPr>
+              <w:t>8,36%</w:t>
             </w:r>
           </w:p>
         </w:tc>
@@ -9671,7 +9671,7 @@
               <w:rPr>
                 <w:sz w:val="16"/>
               </w:rPr>
-              <w:t>TRT21</w:t>
+              <w:t>TRT2</w:t>
             </w:r>
           </w:p>
         </w:tc>
@@ -9728,26 +9728,26 @@
               <w:rPr>
                 <w:sz w:val="16"/>
               </w:rPr>
-              <w:t>233</w:t>
-            </w:r>
-          </w:p>
-        </w:tc>
-        <w:tc>
-          <w:tcPr>
-            <w:tcW w:type="dxa" w:w="1813"/>
-            <w:vAlign w:val="center"/>
-            <w:noWrap/>
-          </w:tcPr>
-          <w:p>
-            <w:pPr>
-              <w:spacing w:before="60" w:after="60"/>
-              <w:jc w:val="center"/>
-            </w:pPr>
-            <w:r>
-              <w:rPr>
-                <w:sz w:val="16"/>
-              </w:rPr>
-              <w:t>0,65%</w:t>
+              <w:t>1724</w:t>
+            </w:r>
+          </w:p>
+        </w:tc>
+        <w:tc>
+          <w:tcPr>
+            <w:tcW w:type="dxa" w:w="1813"/>
+            <w:vAlign w:val="center"/>
+            <w:noWrap/>
+          </w:tcPr>
+          <w:p>
+            <w:pPr>
+              <w:spacing w:before="60" w:after="60"/>
+              <w:jc w:val="center"/>
+            </w:pPr>
+            <w:r>
+              <w:rPr>
+                <w:sz w:val="16"/>
+              </w:rPr>
+              <w:t>4,79%</w:t>
             </w:r>
           </w:p>
         </w:tc>
@@ -9768,7 +9768,7 @@
               <w:rPr>
                 <w:sz w:val="16"/>
               </w:rPr>
-              <w:t>TSE</w:t>
+              <w:t>TRT21</w:t>
             </w:r>
           </w:p>
         </w:tc>
@@ -9825,26 +9825,26 @@
               <w:rPr>
                 <w:sz w:val="16"/>
               </w:rPr>
-              <w:t>363</w:t>
-            </w:r>
-          </w:p>
-        </w:tc>
-        <w:tc>
-          <w:tcPr>
-            <w:tcW w:type="dxa" w:w="1813"/>
-            <w:vAlign w:val="center"/>
-            <w:noWrap/>
-          </w:tcPr>
-          <w:p>
-            <w:pPr>
-              <w:spacing w:before="60" w:after="60"/>
-              <w:jc w:val="center"/>
-            </w:pPr>
-            <w:r>
-              <w:rPr>
-                <w:sz w:val="16"/>
-              </w:rPr>
-              <w:t>1,01%</w:t>
+              <w:t>233</w:t>
+            </w:r>
+          </w:p>
+        </w:tc>
+        <w:tc>
+          <w:tcPr>
+            <w:tcW w:type="dxa" w:w="1813"/>
+            <w:vAlign w:val="center"/>
+            <w:noWrap/>
+          </w:tcPr>
+          <w:p>
+            <w:pPr>
+              <w:spacing w:before="60" w:after="60"/>
+              <w:jc w:val="center"/>
+            </w:pPr>
+            <w:r>
+              <w:rPr>
+                <w:sz w:val="16"/>
+              </w:rPr>
+              <w:t>0,65%</w:t>
             </w:r>
           </w:p>
         </w:tc>
@@ -10447,7 +10447,7 @@
               <w:rPr>
                 <w:sz w:val="16"/>
               </w:rPr>
-              <w:t>TJETO</w:t>
+              <w:t>TSE</w:t>
             </w:r>
           </w:p>
         </w:tc>
@@ -10504,26 +10504,26 @@
               <w:rPr>
                 <w:sz w:val="16"/>
               </w:rPr>
-              <w:t>1</w:t>
-            </w:r>
-          </w:p>
-        </w:tc>
-        <w:tc>
-          <w:tcPr>
-            <w:tcW w:type="dxa" w:w="1813"/>
-            <w:vAlign w:val="center"/>
-            <w:noWrap/>
-          </w:tcPr>
-          <w:p>
-            <w:pPr>
-              <w:spacing w:before="60" w:after="60"/>
-              <w:jc w:val="center"/>
-            </w:pPr>
-            <w:r>
-              <w:rPr>
-                <w:sz w:val="16"/>
-              </w:rPr>
-              <w:t>0,00%</w:t>
+              <w:t>363</w:t>
+            </w:r>
+          </w:p>
+        </w:tc>
+        <w:tc>
+          <w:tcPr>
+            <w:tcW w:type="dxa" w:w="1813"/>
+            <w:vAlign w:val="center"/>
+            <w:noWrap/>
+          </w:tcPr>
+          <w:p>
+            <w:pPr>
+              <w:spacing w:before="60" w:after="60"/>
+              <w:jc w:val="center"/>
+            </w:pPr>
+            <w:r>
+              <w:rPr>
+                <w:sz w:val="16"/>
+              </w:rPr>
+              <w:t>1,01%</w:t>
             </w:r>
           </w:p>
         </w:tc>
@@ -10976,7 +10976,7 @@
         <w:rPr>
           <w:b/>
         </w:rPr>
-        <w:t>R$ 627,60</w:t>
+        <w:t>R$ 627,43</w:t>
       </w:r>
       <w:r>
         <w:t xml:space="preserve">, seguidos pelos Analistas, com </w:t>
@@ -10985,7 +10985,7 @@
         <w:rPr>
           <w:b/>
         </w:rPr>
-        <w:t>R$ 357,25.</w:t>
+        <w:t>R$ 357,16.</w:t>
       </w:r>
     </w:p>
     <w:p>
@@ -11325,7 +11325,7 @@
                 <w:b/>
                 <w:sz w:val="16"/>
               </w:rPr>
-              <w:t>R$ 74.048.506,00</w:t>
+              <w:t>R$ 74.048.592,68</w:t>
             </w:r>
           </w:p>
         </w:tc>
@@ -11365,7 +11365,7 @@
                 <w:b/>
                 <w:sz w:val="16"/>
               </w:rPr>
-              <w:t>R$ 3.937.028.378,02</w:t>
+              <w:t>R$ 3.938.167.460,73</w:t>
             </w:r>
           </w:p>
         </w:tc>
@@ -11463,26 +11463,26 @@
               <w:rPr>
                 <w:sz w:val="16"/>
               </w:rPr>
-              <w:t>R$ 456.682.554,07</w:t>
-            </w:r>
-          </w:p>
-        </w:tc>
-        <w:tc>
-          <w:tcPr>
-            <w:tcW w:type="dxa" w:w="1813"/>
-            <w:vAlign w:val="center"/>
-            <w:noWrap/>
-          </w:tcPr>
-          <w:p>
-            <w:pPr>
-              <w:spacing w:before="60" w:after="60"/>
-              <w:jc w:val="center"/>
-            </w:pPr>
-            <w:r>
-              <w:rPr>
-                <w:sz w:val="16"/>
-              </w:rPr>
-              <w:t>11,60%</w:t>
+              <w:t>R$ 457.803.868,88</w:t>
+            </w:r>
+          </w:p>
+        </w:tc>
+        <w:tc>
+          <w:tcPr>
+            <w:tcW w:type="dxa" w:w="1813"/>
+            <w:vAlign w:val="center"/>
+            <w:noWrap/>
+          </w:tcPr>
+          <w:p>
+            <w:pPr>
+              <w:spacing w:before="60" w:after="60"/>
+              <w:jc w:val="center"/>
+            </w:pPr>
+            <w:r>
+              <w:rPr>
+                <w:sz w:val="16"/>
+              </w:rPr>
+              <w:t>11,62%</w:t>
             </w:r>
           </w:p>
         </w:tc>
@@ -12045,7 +12045,7 @@
               <w:rPr>
                 <w:sz w:val="16"/>
               </w:rPr>
-              <w:t>R$ 153.231.437,40</w:t>
+              <w:t>R$ 153.231.580,56</w:t>
             </w:r>
           </w:p>
         </w:tc>
@@ -12549,7 +12549,7 @@
               <w:rPr>
                 <w:sz w:val="16"/>
               </w:rPr>
-              <w:t>1,51%</w:t>
+              <w:t>1,50%</w:t>
             </w:r>
           </w:p>
         </w:tc>
@@ -13015,7 +13015,7 @@
               <w:rPr>
                 <w:sz w:val="16"/>
               </w:rPr>
-              <w:t>R$ 52.529.289,33</w:t>
+              <w:t>R$ 52.538.250,59</w:t>
             </w:r>
           </w:p>
         </w:tc>
@@ -13112,7 +13112,7 @@
               <w:rPr>
                 <w:sz w:val="16"/>
               </w:rPr>
-              <w:t>R$ 55.834.454,79</w:t>
+              <w:t>R$ 55.834.484,23</w:t>
             </w:r>
           </w:p>
         </w:tc>
@@ -13325,7 +13325,7 @@
               <w:rPr>
                 <w:sz w:val="16"/>
               </w:rPr>
-              <w:t>1,32%</w:t>
+              <w:t>1,31%</w:t>
             </w:r>
           </w:p>
         </w:tc>
@@ -13403,7 +13403,7 @@
               <w:rPr>
                 <w:sz w:val="16"/>
               </w:rPr>
-              <w:t>R$ 56.559.894,10</w:t>
+              <w:t>R$ 56.564.124,76</w:t>
             </w:r>
           </w:p>
         </w:tc>
@@ -14198,7 +14198,7 @@
               <w:rPr>
                 <w:sz w:val="16"/>
               </w:rPr>
-              <w:t>0,87%</w:t>
+              <w:t>0,86%</w:t>
             </w:r>
           </w:p>
         </w:tc>
@@ -14470,7 +14470,7 @@
               <w:rPr>
                 <w:sz w:val="16"/>
               </w:rPr>
-              <w:t>R$ 26.436.542,75</w:t>
+              <w:t>R$ 26.439.899,23</w:t>
             </w:r>
           </w:p>
         </w:tc>
@@ -16895,7 +16895,7 @@
               <w:rPr>
                 <w:sz w:val="16"/>
               </w:rPr>
-              <w:t>R$ 11.690.570,23</w:t>
+              <w:t>R$ 11.691.530,45</w:t>
             </w:r>
           </w:p>
         </w:tc>
@@ -18991,7 +18991,7 @@
               <w:rPr>
                 <w:sz w:val="16"/>
               </w:rPr>
-              <w:t>R$ 144.139,84</w:t>
+              <w:t>R$ 144.198,40</w:t>
             </w:r>
           </w:p>
         </w:tc>
@@ -19029,7 +19029,7 @@
               <w:rPr>
                 <w:sz w:val="16"/>
               </w:rPr>
-              <w:t>R$ 8.127.036,49</w:t>
+              <w:t>R$ 8.127.095,05</w:t>
             </w:r>
           </w:p>
         </w:tc>
@@ -19379,7 +19379,7 @@
               <w:rPr>
                 <w:sz w:val="16"/>
               </w:rPr>
-              <w:t>R$ 122.603,98</w:t>
+              <w:t>R$ 122.632,10</w:t>
             </w:r>
           </w:p>
         </w:tc>
@@ -19417,7 +19417,7 @@
               <w:rPr>
                 <w:sz w:val="16"/>
               </w:rPr>
-              <w:t>R$ 6.366.122,11</w:t>
+              <w:t>R$ 6.366.150,23</w:t>
             </w:r>
           </w:p>
         </w:tc>

</xml_diff>